<commit_message>
Integrate multicam operations and surgical state updates
</commit_message>
<xml_diff>
--- a/docs/Taskplanner_ROS2_External_Interface_Contract_v0.3.0_KO.docx
+++ b/docs/Taskplanner_ROS2_External_Interface_Contract_v0.3.0_KO.docx
@@ -87,7 +87,7 @@
           <w:color w:val="20262E"/>
           <w:sz w:val="20"/>
         </w:rPr>
-        <w:t>surgical_interop_msgs 0.3.0 / schema 1.0.0</w:t>
+        <w:t>surgical_interop_msgs 0.3.0 / schema 1.1.0</w:t>
       </w:r>
     </w:p>
     <w:p>
@@ -110,7 +110,7 @@
           <w:color w:val="20262E"/>
           <w:sz w:val="20"/>
         </w:rPr>
-        <w:t>ROS 2 Jazzy · Fast DDS 검증 기준</w:t>
+        <w:t>ROS 2 Jazzy · Cyclone DDS 검증 기준</w:t>
       </w:r>
     </w:p>
     <w:p>
@@ -133,7 +133,7 @@
           <w:color w:val="20262E"/>
           <w:sz w:val="20"/>
         </w:rPr>
-        <w:t>local main@0cc6e783ba52 + 동봉 IDL SHA-256</w:t>
+        <w:t>local main@caecaf144b3e + 동봉 IDL SHA-256</w:t>
       </w:r>
     </w:p>
     <w:p>
@@ -177,9 +177,20 @@
       </w:r>
     </w:p>
     <w:p>
-      <w:r>
-        <w:br w:type="page"/>
-      </w:r>
+      <w:pPr>
+        <w:sectPr>
+          <w:headerReference w:type="default" r:id="rId9"/>
+          <w:footerReference w:type="default" r:id="rId10"/>
+          <w:headerReference w:type="first" r:id="rId11"/>
+          <w:headerReference w:type="even" r:id="rId12"/>
+          <w:footerReference w:type="first" r:id="rId13"/>
+          <w:footerReference w:type="even" r:id="rId14"/>
+          <w:pgSz w:w="12240" w:h="15840"/>
+          <w:pgMar w:top="1440" w:right="1440" w:bottom="1440" w:left="1440" w:header="708" w:footer="708" w:gutter="0"/>
+          <w:cols w:space="720"/>
+          <w:docGrid w:linePitch="360"/>
+        </w:sectPr>
+      </w:pPr>
     </w:p>
     <w:p>
       <w:pPr>
@@ -433,7 +444,7 @@
                 <w:color w:val="20262E"/>
                 <w:sz w:val="17"/>
               </w:rPr>
-              <w:t>1.0.0 / surgical_interop_msgs 0.3.0</w:t>
+              <w:t>1.1.0 / surgical_interop_msgs 0.3.0</w:t>
             </w:r>
           </w:p>
         </w:tc>
@@ -488,7 +499,7 @@
                 <w:color w:val="20262E"/>
                 <w:sz w:val="17"/>
               </w:rPr>
-              <w:t>local main@0cc6e783ba52 + 부록 A의 IDL SHA-256</w:t>
+              <w:t>local main@caecaf144b3e + 부록 A의 IDL SHA-256</w:t>
             </w:r>
           </w:p>
         </w:tc>
@@ -1698,7 +1709,7 @@
           <w:rFonts w:ascii="NanumBarunGothic" w:hAnsi="NanumBarunGothic" w:eastAsia="NanumBarunGothic" w:cs="NanumBarunGothic"/>
           <w:sz w:val="22"/>
         </w:rPr>
-        <w:t>0.3.0의 rank-1 도구 예측과 semantic robot-hand possession은 명시적으로 검토된 좁은 예외다. 그 때문에 내부 /twin/world_state 전체가 공개되는 것은 아니다.</w:t>
+        <w:t>0.3.0의 Top-3 도구 예측과 semantic robot-hand possession은 명시적으로 검토된 좁은 예외다. 그 때문에 내부 /twin/world_state 전체가 공개되는 것은 아니다.</w:t>
       </w:r>
     </w:p>
     <w:p>
@@ -2896,7 +2907,7 @@
                 <w:color w:val="20262E"/>
                 <w:sz w:val="17"/>
               </w:rPr>
-              <w:t>/flir_camera/image_color/compressed</w:t>
+              <w:t>/synced/flir/color/image_raw/compressed</w:t>
             </w:r>
           </w:p>
         </w:tc>
@@ -2976,7 +2987,7 @@
                 <w:color w:val="20262E"/>
                 <w:sz w:val="17"/>
               </w:rPr>
-              <w:t>/camera/cam_4/color/image_raw/compressed</w:t>
+              <w:t>/synced/cam_4/color/image_raw/compressed</w:t>
             </w:r>
           </w:p>
         </w:tc>
@@ -3612,7 +3623,7 @@
                 <w:color w:val="20262E"/>
                 <w:sz w:val="17"/>
               </w:rPr>
-              <w:t>기관 간 합의값으로 변경 가능; 양측이 반드시 같아야 함</w:t>
+              <w:t>현재 외부 통합 고정값; 양측이 반드시 같아야 함</w:t>
             </w:r>
           </w:p>
         </w:tc>
@@ -3747,7 +3758,7 @@
                 <w:color w:val="20262E"/>
                 <w:sz w:val="17"/>
               </w:rPr>
-              <w:t>rmw_fastrtps_cpp</w:t>
+              <w:t>rmw_cyclonedds_cpp</w:t>
             </w:r>
           </w:p>
         </w:tc>
@@ -3772,7 +3783,87 @@
                 <w:color w:val="20262E"/>
                 <w:sz w:val="17"/>
               </w:rPr>
-              <w:t>상호 호환 및 실제 discovery 검증 필요</w:t>
+              <w:t>양측 일치 및 실제 discovery 검증 필요</w:t>
+            </w:r>
+          </w:p>
+        </w:tc>
+      </w:tr>
+      <w:tr>
+        <w:trPr>
+          <w:cantSplit/>
+        </w:trPr>
+        <w:tc>
+          <w:tcPr>
+            <w:tcW w:type="dxa" w:w="2600"/>
+            <w:tcMar>
+              <w:top w:w="80" w:type="dxa"/>
+              <w:start w:w="120" w:type="dxa"/>
+              <w:bottom w:w="80" w:type="dxa"/>
+              <w:end w:w="120" w:type="dxa"/>
+            </w:tcMar>
+            <w:vAlign w:val="top"/>
+          </w:tcPr>
+          <w:p>
+            <w:pPr>
+              <w:spacing w:after="0" w:line="252" w:lineRule="auto"/>
+            </w:pPr>
+            <w:r>
+              <w:rPr>
+                <w:rFonts w:ascii="NanumBarunGothic" w:hAnsi="NanumBarunGothic" w:eastAsia="NanumBarunGothic" w:cs="NanumBarunGothic"/>
+                <w:color w:val="20262E"/>
+                <w:sz w:val="17"/>
+              </w:rPr>
+              <w:t>Cyclone profile</w:t>
+            </w:r>
+          </w:p>
+        </w:tc>
+        <w:tc>
+          <w:tcPr>
+            <w:tcW w:type="dxa" w:w="2280"/>
+            <w:tcMar>
+              <w:top w:w="80" w:type="dxa"/>
+              <w:start w:w="120" w:type="dxa"/>
+              <w:bottom w:w="80" w:type="dxa"/>
+              <w:end w:w="120" w:type="dxa"/>
+            </w:tcMar>
+            <w:vAlign w:val="top"/>
+          </w:tcPr>
+          <w:p>
+            <w:pPr>
+              <w:spacing w:after="0" w:line="252" w:lineRule="auto"/>
+            </w:pPr>
+            <w:r>
+              <w:rPr>
+                <w:rFonts w:ascii="NanumBarunGothic" w:hAnsi="NanumBarunGothic" w:eastAsia="NanumBarunGothic" w:cs="NanumBarunGothic"/>
+                <w:color w:val="20262E"/>
+                <w:sz w:val="17"/>
+              </w:rPr>
+              <w:t>wired NIC + FragmentSize 1344B</w:t>
+            </w:r>
+          </w:p>
+        </w:tc>
+        <w:tc>
+          <w:tcPr>
+            <w:tcW w:type="dxa" w:w="4480"/>
+            <w:tcMar>
+              <w:top w:w="80" w:type="dxa"/>
+              <w:start w:w="120" w:type="dxa"/>
+              <w:bottom w:w="80" w:type="dxa"/>
+              <w:end w:w="120" w:type="dxa"/>
+            </w:tcMar>
+            <w:vAlign w:val="top"/>
+          </w:tcPr>
+          <w:p>
+            <w:pPr>
+              <w:spacing w:after="0" w:line="252" w:lineRule="auto"/>
+            </w:pPr>
+            <w:r>
+              <w:rPr>
+                <w:rFonts w:ascii="NanumBarunGothic" w:hAnsi="NanumBarunGothic" w:eastAsia="NanumBarunGothic" w:cs="NanumBarunGothic"/>
+                <w:color w:val="20262E"/>
+                <w:sz w:val="17"/>
+              </w:rPr>
+              <w:t>1500-byte MTU에서 IP fragmentation 회피</w:t>
             </w:r>
           </w:p>
         </w:tc>
@@ -4270,7 +4361,7 @@
           <w:rFonts w:ascii="NanumBarunGothic" w:hAnsi="NanumBarunGothic" w:eastAsia="NanumBarunGothic" w:cs="NanumBarunGothic"/>
           <w:sz w:val="22"/>
         </w:rPr>
-        <w:t>문서의 Domain 0은 현재 local deployment의 기본값이지 영구 wire 상수가 아니다. 배포 담당자는 실제 접속 전에 Domain, RMW, discovery range, interface/subnet과 방화벽을 하나의 인수표로 제공해야 한다.</w:t>
+        <w:t>현재 외부 통합 runtime, ASR, public bridge와 Debug sidecar는 Domain 0, SUBNET, Cyclone DDS 및 검토된 wired profile을 함께 사용한다. replay/shadow는 외부 통합 참가자가 아니며 D71/LOCALHOST로 격리한다. 배포 담당자는 실제 접속 전에 Domain, RMW, discovery range, interface/subnet, MTU와 방화벽을 하나의 인수표로 제공해야 한다.</w:t>
       </w:r>
     </w:p>
     <w:p>
@@ -4812,7 +4903,7 @@
                 <w:color w:val="20262E"/>
                 <w:sz w:val="17"/>
               </w:rPr>
-              <w:t>Keep Last 1</w:t>
+              <w:t>Keep Last 5</w:t>
             </w:r>
           </w:p>
         </w:tc>
@@ -4837,7 +4928,7 @@
                 <w:color w:val="20262E"/>
                 <w:sz w:val="17"/>
               </w:rPr>
-              <w:t>latest frame only</w:t>
+              <w:t>latest frames, demand-gated</w:t>
             </w:r>
           </w:p>
         </w:tc>
@@ -7845,7 +7936,7 @@
           <w:color w:val="20262E"/>
           <w:sz w:val="16"/>
         </w:rPr>
-        <w:t>schema_version: "1.0.0"</w:t>
+        <w:t>schema_version: "1.1.0"</w:t>
         <w:br/>
         <w:t>interface_version: "0.3.0"</w:t>
         <w:br/>
@@ -8692,7 +8783,7 @@
                 <w:color w:val="20262E"/>
                 <w:sz w:val="17"/>
               </w:rPr>
-              <w:t>location은 3D pose가 아니다. visible=false는 현재 '시각적 부재'가 아니라 visibility 단언 없음이다.</w:t>
+              <w:t>집도의: holder_role=surgeon + state=handed_over|in_use. Mayo: location_type=mayo_stand; 회수 여부는 state=parked_for_reuse|awaiting_retrieval로 구분한다.</w:t>
             </w:r>
           </w:p>
         </w:tc>
@@ -8725,9 +8816,9 @@
         <w:br/>
         <w:t xml:space="preserve">    instance_id: "T04#1"</w:t>
         <w:br/>
-        <w:t xml:space="preserve">    location_type: surgeon_hand</w:t>
-        <w:br/>
-        <w:t xml:space="preserve">    location_id: surgeon_right_hand</w:t>
+        <w:t xml:space="preserve">    location_type: surgeon</w:t>
+        <w:br/>
+        <w:t xml:space="preserve">    location_id: surgeon</w:t>
         <w:br/>
         <w:t xml:space="preserve">    holder_role: surgeon</w:t>
         <w:br/>
@@ -9536,7 +9627,7 @@
                 <w:color w:val="20262E"/>
                 <w:sz w:val="17"/>
               </w:rPr>
-              <w:t>현재 구현은 reducer가 수용한 rank 1 next-tool forecast를 confidence/stability와 함께 제공한다.</w:t>
+              <w:t>현재 구현은 reducer가 수용한 next-tool forecast를 confidence 내림차순 Top-3까지 제공한다.</w:t>
             </w:r>
           </w:p>
         </w:tc>
@@ -9624,6 +9715,34 @@
         <w:t xml:space="preserve">    confidence: 0.87</w:t>
         <w:br/>
         <w:t xml:space="preserve">    stability_sec: 3.4</w:t>
+        <w:br/>
+        <w:t xml:space="preserve">    source: digital_twin</w:t>
+        <w:br/>
+        <w:t xml:space="preserve">    evidence_status: DT_ACCEPTED</w:t>
+        <w:br/>
+        <w:t xml:space="preserve">  - rank: 2</w:t>
+        <w:br/>
+        <w:t xml:space="preserve">    instrument_id: T04</w:t>
+        <w:br/>
+        <w:t xml:space="preserve">    instance_id: ""</w:t>
+        <w:br/>
+        <w:t xml:space="preserve">    confidence: 0.73</w:t>
+        <w:br/>
+        <w:t xml:space="preserve">    stability_sec: 0.0</w:t>
+        <w:br/>
+        <w:t xml:space="preserve">    source: digital_twin</w:t>
+        <w:br/>
+        <w:t xml:space="preserve">    evidence_status: DT_ACCEPTED</w:t>
+        <w:br/>
+        <w:t xml:space="preserve">  - rank: 3</w:t>
+        <w:br/>
+        <w:t xml:space="preserve">    instrument_id: T07</w:t>
+        <w:br/>
+        <w:t xml:space="preserve">    instance_id: ""</w:t>
+        <w:br/>
+        <w:t xml:space="preserve">    confidence: 0.61</w:t>
+        <w:br/>
+        <w:t xml:space="preserve">    stability_sec: 0.0</w:t>
         <w:br/>
         <w:t xml:space="preserve">    source: digital_twin</w:t>
         <w:br/>
@@ -10276,9 +10395,9 @@
         <w:br/>
         <w:t xml:space="preserve">    observed_tool_ids: [T08]</w:t>
         <w:br/>
-        <w:t xml:space="preserve">    observed_location_types: [surgical_field]</w:t>
-        <w:br/>
-        <w:t xml:space="preserve">    observed_location_ids: [surgical_field]</w:t>
+        <w:t xml:space="preserve">    observed_location_types: [surgeon]</w:t>
+        <w:br/>
+        <w:t xml:space="preserve">    observed_location_ids: [surgeon]</w:t>
         <w:br/>
         <w:t xml:space="preserve">    observed_confidences: [0.84]</w:t>
         <w:br/>
@@ -10915,7 +11034,7 @@
         </w:rPr>
         <w:t>sequence: 287</w:t>
         <w:br/>
-        <w:t>schema_version: "1.0.0"</w:t>
+        <w:t>schema_version: "1.1.0"</w:t>
         <w:br/>
         <w:t>catalog_version: "sha256:&lt;catalog digest&gt;"</w:t>
         <w:br/>
@@ -11204,7 +11323,7 @@
                 <w:color w:val="20262E"/>
                 <w:sz w:val="17"/>
               </w:rPr>
-              <w:t>/flir_camera/image_color/compressed</w:t>
+              <w:t>/synced/flir/color/image_raw/compressed</w:t>
             </w:r>
           </w:p>
         </w:tc>
@@ -11229,7 +11348,7 @@
                 <w:color w:val="20262E"/>
                 <w:sz w:val="17"/>
               </w:rPr>
-              <w:t>BestEffort/Volatile/KL1</w:t>
+              <w:t>BestEffort/Volatile/KL5</w:t>
             </w:r>
           </w:p>
         </w:tc>
@@ -11309,7 +11428,7 @@
                 <w:color w:val="20262E"/>
                 <w:sz w:val="17"/>
               </w:rPr>
-              <w:t>/camera/cam_4/color/image_raw/compressed</w:t>
+              <w:t>/synced/cam_4/color/image_raw/compressed</w:t>
             </w:r>
           </w:p>
         </w:tc>
@@ -11334,7 +11453,7 @@
                 <w:color w:val="20262E"/>
                 <w:sz w:val="17"/>
               </w:rPr>
-              <w:t>BestEffort/Volatile/KL1</w:t>
+              <w:t>BestEffort/Volatile/KL5</w:t>
             </w:r>
           </w:p>
         </w:tc>
@@ -18463,7 +18582,7 @@
           <w:rFonts w:ascii="NanumBarunGothic" w:hAnsi="NanumBarunGothic" w:eastAsia="NanumBarunGothic" w:cs="NanumBarunGothic"/>
           <w:sz w:val="22"/>
         </w:rPr>
-        <w:t>소스 기준은 local main@0cc6e783ba52이며, 아래 해시는 이 문서에 실제로 포함된 worktree IDL bytes를 식별한다. commit되지 않은 변경이 있는 경우 commit hash만으로 동일성을 주장하면 안 된다.</w:t>
+        <w:t>소스 기준은 local main@caecaf144b3e이며, 아래 해시는 이 문서에 실제로 포함된 worktree IDL bytes를 식별한다. commit되지 않은 변경이 있는 경우 commit hash만으로 동일성을 주장하면 안 된다.</w:t>
       </w:r>
     </w:p>
     <w:p>
@@ -19827,7 +19946,7 @@
           <w:rFonts w:ascii="NanumBarunGothic" w:hAnsi="NanumBarunGothic" w:eastAsia="NanumBarunGothic" w:cs="NanumBarunGothic"/>
           <w:sz w:val="22"/>
         </w:rPr>
-        <w:t>추가 runtime 의미 계약: docs/SHARED_SURGICAL_STATE_CONTRACT.md · SHA-256 b82b1ed6d7554af4336fad6b155d2a913676919994f4e891c2f53884bfbcd137</w:t>
+        <w:t>추가 runtime 의미 계약: docs/SHARED_SURGICAL_STATE_CONTRACT.md · SHA-256 8c93dd8bfa5098c8aec847c4c1f2d74d2e8afed28d437a97a4f5625af9955791</w:t>
       </w:r>
     </w:p>
     <w:p>
@@ -21108,16 +21227,15 @@
       </w:r>
     </w:p>
     <w:sectPr>
-      <w:headerReference w:type="default" r:id="rId9"/>
-      <w:footerReference w:type="default" r:id="rId10"/>
-      <w:headerReference w:type="first" r:id="rId11"/>
-      <w:headerReference w:type="even" r:id="rId12"/>
-      <w:footerReference w:type="first" r:id="rId13"/>
-      <w:footerReference w:type="even" r:id="rId14"/>
+      <w:headerReference w:type="default" r:id="rId15"/>
+      <w:headerReference w:type="even" r:id="rId16"/>
+      <w:headerReference w:type="first" r:id="rId17"/>
+      <w:footerReference w:type="default" r:id="rId18"/>
+      <w:footerReference w:type="even" r:id="rId19"/>
+      <w:footerReference w:type="first" r:id="rId20"/>
       <w:pgSz w:w="12240" w:h="15840"/>
       <w:pgMar w:top="1440" w:right="1440" w:bottom="1440" w:left="1440" w:header="708" w:footer="708" w:gutter="0"/>
       <w:cols w:space="720"/>
-      <w:titlePg/>
       <w:docGrid w:linePitch="360"/>
     </w:sectPr>
   </w:body>
@@ -21129,28 +21247,8 @@
   <w:p>
     <w:pPr>
       <w:pStyle w:val="Footer"/>
-      <w:jc w:val="center"/>
+      <w:jc w:val="right"/>
     </w:pPr>
-    <w:r>
-      <w:rPr>
-        <w:rFonts w:ascii="NanumBarunGothic" w:hAnsi="NanumBarunGothic" w:eastAsia="NanumBarunGothic" w:cs="NanumBarunGothic"/>
-        <w:color w:val="5B636F"/>
-        <w:sz w:val="17"/>
-      </w:rPr>
-      <w:t xml:space="preserve">Taskplanner Integration Baseline  |  </w:t>
-    </w:r>
-    <w:r>
-      <w:rPr>
-        <w:rFonts w:ascii="NanumBarunGothic" w:hAnsi="NanumBarunGothic" w:eastAsia="NanumBarunGothic" w:cs="NanumBarunGothic"/>
-        <w:color w:val="5B636F"/>
-        <w:sz w:val="17"/>
-      </w:rPr>
-      <w:fldChar w:fldCharType="begin"/>
-      <w:instrText xml:space="preserve"> PAGE </w:instrText>
-      <w:fldChar w:fldCharType="separate"/>
-      <w:t>1</w:t>
-      <w:fldChar w:fldCharType="end"/>
-    </w:r>
   </w:p>
 </w:ftr>
 </file>
@@ -21170,6 +21268,78 @@
   <w:p>
     <w:pPr>
       <w:pStyle w:val="Footer"/>
+    </w:pPr>
+  </w:p>
+</w:ftr>
+</file>
+
+<file path=word/footer4.xml><?xml version="1.0" encoding="utf-8"?>
+<w:ftr xmlns:m="http://schemas.openxmlformats.org/officeDocument/2006/math" xmlns:mc="http://schemas.openxmlformats.org/markup-compatibility/2006" xmlns:mo="http://schemas.microsoft.com/office/mac/office/2008/main" xmlns:mv="urn:schemas-microsoft-com:mac:vml" xmlns:o="urn:schemas-microsoft-com:office:office" xmlns:r="http://schemas.openxmlformats.org/officeDocument/2006/relationships" xmlns:v="urn:schemas-microsoft-com:vml" xmlns:w10="urn:schemas-microsoft-com:office:word" xmlns:w14="http://schemas.microsoft.com/office/word/2010/wordml" xmlns:w="http://schemas.openxmlformats.org/wordprocessingml/2006/main" xmlns:wne="http://schemas.microsoft.com/office/word/2006/wordml" xmlns:wp14="http://schemas.microsoft.com/office/word/2010/wordprocessingDrawing" xmlns:wp="http://schemas.openxmlformats.org/drawingml/2006/wordprocessingDrawing" xmlns:wpc="http://schemas.microsoft.com/office/word/2010/wordprocessingCanvas" xmlns:wpg="http://schemas.microsoft.com/office/word/2010/wordprocessingGroup" xmlns:wpi="http://schemas.microsoft.com/office/word/2010/wordprocessingInk" xmlns:wps="http://schemas.microsoft.com/office/word/2010/wordprocessingShape" mc:Ignorable="w14 wp14">
+  <w:p>
+    <w:pPr>
+      <w:pStyle w:val="Footer"/>
+      <w:jc w:val="center"/>
+    </w:pPr>
+    <w:r>
+      <w:rPr>
+        <w:rFonts w:ascii="NanumBarunGothic" w:hAnsi="NanumBarunGothic" w:eastAsia="NanumBarunGothic" w:cs="NanumBarunGothic"/>
+        <w:color w:val="5B636F"/>
+        <w:sz w:val="17"/>
+      </w:rPr>
+      <w:t xml:space="preserve">Taskplanner Integration Baseline  |  </w:t>
+    </w:r>
+    <w:r>
+      <w:rPr>
+        <w:rFonts w:ascii="NanumBarunGothic" w:hAnsi="NanumBarunGothic" w:eastAsia="NanumBarunGothic" w:cs="NanumBarunGothic"/>
+        <w:color w:val="5B636F"/>
+        <w:sz w:val="17"/>
+      </w:rPr>
+      <w:fldChar w:fldCharType="begin"/>
+      <w:instrText xml:space="preserve"> PAGE </w:instrText>
+      <w:fldChar w:fldCharType="separate"/>
+      <w:t>1</w:t>
+      <w:fldChar w:fldCharType="end"/>
+    </w:r>
+  </w:p>
+</w:ftr>
+</file>
+
+<file path=word/footer5.xml><?xml version="1.0" encoding="utf-8"?>
+<w:ftr xmlns:m="http://schemas.openxmlformats.org/officeDocument/2006/math" xmlns:mc="http://schemas.openxmlformats.org/markup-compatibility/2006" xmlns:mo="http://schemas.microsoft.com/office/mac/office/2008/main" xmlns:mv="urn:schemas-microsoft-com:mac:vml" xmlns:o="urn:schemas-microsoft-com:office:office" xmlns:r="http://schemas.openxmlformats.org/officeDocument/2006/relationships" xmlns:v="urn:schemas-microsoft-com:vml" xmlns:w10="urn:schemas-microsoft-com:office:word" xmlns:w14="http://schemas.microsoft.com/office/word/2010/wordml" xmlns:w="http://schemas.openxmlformats.org/wordprocessingml/2006/main" xmlns:wne="http://schemas.microsoft.com/office/word/2006/wordml" xmlns:wp14="http://schemas.microsoft.com/office/word/2010/wordprocessingDrawing" xmlns:wp="http://schemas.openxmlformats.org/drawingml/2006/wordprocessingDrawing" xmlns:wpc="http://schemas.microsoft.com/office/word/2010/wordprocessingCanvas" xmlns:wpg="http://schemas.microsoft.com/office/word/2010/wordprocessingGroup" xmlns:wpi="http://schemas.microsoft.com/office/word/2010/wordprocessingInk" xmlns:wps="http://schemas.microsoft.com/office/word/2010/wordprocessingShape" mc:Ignorable="w14 wp14">
+  <w:p>
+    <w:pPr>
+      <w:pStyle w:val="Footer"/>
+      <w:jc w:val="center"/>
+    </w:pPr>
+    <w:r>
+      <w:rPr>
+        <w:rFonts w:ascii="NanumBarunGothic" w:hAnsi="NanumBarunGothic" w:eastAsia="NanumBarunGothic" w:cs="NanumBarunGothic"/>
+        <w:color w:val="5B636F"/>
+        <w:sz w:val="17"/>
+      </w:rPr>
+      <w:t xml:space="preserve">Taskplanner Integration Baseline  |  </w:t>
+    </w:r>
+    <w:r>
+      <w:rPr>
+        <w:rFonts w:ascii="NanumBarunGothic" w:hAnsi="NanumBarunGothic" w:eastAsia="NanumBarunGothic" w:cs="NanumBarunGothic"/>
+        <w:color w:val="5B636F"/>
+        <w:sz w:val="17"/>
+      </w:rPr>
+      <w:fldChar w:fldCharType="begin"/>
+      <w:instrText xml:space="preserve"> PAGE </w:instrText>
+      <w:fldChar w:fldCharType="separate"/>
+      <w:t>1</w:t>
+      <w:fldChar w:fldCharType="end"/>
+    </w:r>
+  </w:p>
+</w:ftr>
+</file>
+
+<file path=word/footer6.xml><?xml version="1.0" encoding="utf-8"?>
+<w:ftr xmlns:m="http://schemas.openxmlformats.org/officeDocument/2006/math" xmlns:mc="http://schemas.openxmlformats.org/markup-compatibility/2006" xmlns:mo="http://schemas.microsoft.com/office/mac/office/2008/main" xmlns:mv="urn:schemas-microsoft-com:mac:vml" xmlns:o="urn:schemas-microsoft-com:office:office" xmlns:r="http://schemas.openxmlformats.org/officeDocument/2006/relationships" xmlns:v="urn:schemas-microsoft-com:vml" xmlns:w10="urn:schemas-microsoft-com:office:word" xmlns:w14="http://schemas.microsoft.com/office/word/2010/wordml" xmlns:w="http://schemas.openxmlformats.org/wordprocessingml/2006/main" xmlns:wne="http://schemas.microsoft.com/office/word/2006/wordml" xmlns:wp14="http://schemas.microsoft.com/office/word/2010/wordprocessingDrawing" xmlns:wp="http://schemas.openxmlformats.org/drawingml/2006/wordprocessingDrawing" xmlns:wpc="http://schemas.microsoft.com/office/word/2010/wordprocessingCanvas" xmlns:wpg="http://schemas.microsoft.com/office/word/2010/wordprocessingGroup" xmlns:wpi="http://schemas.microsoft.com/office/word/2010/wordprocessingInk" xmlns:wps="http://schemas.microsoft.com/office/word/2010/wordprocessingShape" mc:Ignorable="w14 wp14">
+  <w:p>
+    <w:pPr>
+      <w:pStyle w:val="Footer"/>
       <w:jc w:val="center"/>
     </w:pPr>
     <w:r>
@@ -21203,28 +21373,9 @@
       <w:pStyle w:val="Header"/>
       <w:tabs>
         <w:tab w:pos="9360" w:val="right"/>
-        <w:tab w:pos="9360" w:val="right"/>
       </w:tabs>
       <w:spacing w:after="0"/>
     </w:pPr>
-    <w:r>
-      <w:rPr>
-        <w:rFonts w:ascii="NanumSquare Neo" w:hAnsi="NanumSquare Neo" w:eastAsia="NanumSquare Neo" w:cs="NanumSquare Neo"/>
-        <w:b/>
-        <w:color w:val="5B636F"/>
-        <w:sz w:val="16"/>
-      </w:rPr>
-      <w:t>TASKPLANNER  |  ROS 2 EXTERNAL INTERFACE CONTRACT</w:t>
-    </w:r>
-    <w:r>
-      <w:rPr>
-        <w:rFonts w:ascii="NanumBarunGothic" w:hAnsi="NanumBarunGothic" w:eastAsia="NanumBarunGothic" w:cs="NanumBarunGothic"/>
-        <w:color w:val="5B636F"/>
-        <w:sz w:val="16"/>
-      </w:rPr>
-      <w:tab/>
-      <w:t>BASELINE 0.3.0</w:t>
-    </w:r>
   </w:p>
 </w:hdr>
 </file>
@@ -21240,6 +21391,78 @@
 </file>
 
 <file path=word/header3.xml><?xml version="1.0" encoding="utf-8"?>
+<w:hdr xmlns:m="http://schemas.openxmlformats.org/officeDocument/2006/math" xmlns:mc="http://schemas.openxmlformats.org/markup-compatibility/2006" xmlns:mo="http://schemas.microsoft.com/office/mac/office/2008/main" xmlns:mv="urn:schemas-microsoft-com:mac:vml" xmlns:o="urn:schemas-microsoft-com:office:office" xmlns:r="http://schemas.openxmlformats.org/officeDocument/2006/relationships" xmlns:v="urn:schemas-microsoft-com:vml" xmlns:w10="urn:schemas-microsoft-com:office:word" xmlns:w14="http://schemas.microsoft.com/office/word/2010/wordml" xmlns:w="http://schemas.openxmlformats.org/wordprocessingml/2006/main" xmlns:wne="http://schemas.microsoft.com/office/word/2006/wordml" xmlns:wp14="http://schemas.microsoft.com/office/word/2010/wordprocessingDrawing" xmlns:wp="http://schemas.openxmlformats.org/drawingml/2006/wordprocessingDrawing" xmlns:wpc="http://schemas.microsoft.com/office/word/2010/wordprocessingCanvas" xmlns:wpg="http://schemas.microsoft.com/office/word/2010/wordprocessingGroup" xmlns:wpi="http://schemas.microsoft.com/office/word/2010/wordprocessingInk" xmlns:wps="http://schemas.microsoft.com/office/word/2010/wordprocessingShape" mc:Ignorable="w14 wp14">
+  <w:p>
+    <w:pPr>
+      <w:pStyle w:val="Header"/>
+    </w:pPr>
+  </w:p>
+</w:hdr>
+</file>
+
+<file path=word/header4.xml><?xml version="1.0" encoding="utf-8"?>
+<w:hdr xmlns:m="http://schemas.openxmlformats.org/officeDocument/2006/math" xmlns:mc="http://schemas.openxmlformats.org/markup-compatibility/2006" xmlns:mo="http://schemas.microsoft.com/office/mac/office/2008/main" xmlns:mv="urn:schemas-microsoft-com:mac:vml" xmlns:o="urn:schemas-microsoft-com:office:office" xmlns:r="http://schemas.openxmlformats.org/officeDocument/2006/relationships" xmlns:v="urn:schemas-microsoft-com:vml" xmlns:w10="urn:schemas-microsoft-com:office:word" xmlns:w14="http://schemas.microsoft.com/office/word/2010/wordml" xmlns:w="http://schemas.openxmlformats.org/wordprocessingml/2006/main" xmlns:wne="http://schemas.microsoft.com/office/word/2006/wordml" xmlns:wp14="http://schemas.microsoft.com/office/word/2010/wordprocessingDrawing" xmlns:wp="http://schemas.openxmlformats.org/drawingml/2006/wordprocessingDrawing" xmlns:wpc="http://schemas.microsoft.com/office/word/2010/wordprocessingCanvas" xmlns:wpg="http://schemas.microsoft.com/office/word/2010/wordprocessingGroup" xmlns:wpi="http://schemas.microsoft.com/office/word/2010/wordprocessingInk" xmlns:wps="http://schemas.microsoft.com/office/word/2010/wordprocessingShape" mc:Ignorable="w14 wp14">
+  <w:p>
+    <w:pPr>
+      <w:pStyle w:val="Header"/>
+      <w:tabs>
+        <w:tab w:pos="9360" w:val="right"/>
+      </w:tabs>
+    </w:pPr>
+    <w:r>
+      <w:rPr>
+        <w:rFonts w:ascii="NanumSquare Neo" w:hAnsi="NanumSquare Neo" w:eastAsia="NanumSquare Neo" w:cs="NanumSquare Neo"/>
+        <w:b/>
+        <w:color w:val="5B636F"/>
+        <w:sz w:val="16"/>
+      </w:rPr>
+      <w:t>TASKPLANNER  |  ROS 2 EXTERNAL INTERFACE CONTRACT</w:t>
+    </w:r>
+    <w:r>
+      <w:rPr>
+        <w:rFonts w:ascii="NanumBarunGothic" w:hAnsi="NanumBarunGothic" w:eastAsia="NanumBarunGothic" w:cs="NanumBarunGothic"/>
+        <w:color w:val="5B636F"/>
+        <w:sz w:val="16"/>
+      </w:rPr>
+      <w:tab/>
+      <w:t>BASELINE 0.3.0</w:t>
+    </w:r>
+  </w:p>
+</w:hdr>
+</file>
+
+<file path=word/header5.xml><?xml version="1.0" encoding="utf-8"?>
+<w:hdr xmlns:m="http://schemas.openxmlformats.org/officeDocument/2006/math" xmlns:mc="http://schemas.openxmlformats.org/markup-compatibility/2006" xmlns:mo="http://schemas.microsoft.com/office/mac/office/2008/main" xmlns:mv="urn:schemas-microsoft-com:mac:vml" xmlns:o="urn:schemas-microsoft-com:office:office" xmlns:r="http://schemas.openxmlformats.org/officeDocument/2006/relationships" xmlns:v="urn:schemas-microsoft-com:vml" xmlns:w10="urn:schemas-microsoft-com:office:word" xmlns:w14="http://schemas.microsoft.com/office/word/2010/wordml" xmlns:w="http://schemas.openxmlformats.org/wordprocessingml/2006/main" xmlns:wne="http://schemas.microsoft.com/office/word/2006/wordml" xmlns:wp14="http://schemas.microsoft.com/office/word/2010/wordprocessingDrawing" xmlns:wp="http://schemas.openxmlformats.org/drawingml/2006/wordprocessingDrawing" xmlns:wpc="http://schemas.microsoft.com/office/word/2010/wordprocessingCanvas" xmlns:wpg="http://schemas.microsoft.com/office/word/2010/wordprocessingGroup" xmlns:wpi="http://schemas.microsoft.com/office/word/2010/wordprocessingInk" xmlns:wps="http://schemas.microsoft.com/office/word/2010/wordprocessingShape" mc:Ignorable="w14 wp14">
+  <w:p>
+    <w:pPr>
+      <w:pStyle w:val="Header"/>
+      <w:tabs>
+        <w:tab w:pos="9360" w:val="right"/>
+      </w:tabs>
+    </w:pPr>
+    <w:r>
+      <w:rPr>
+        <w:rFonts w:ascii="NanumSquare Neo" w:hAnsi="NanumSquare Neo" w:eastAsia="NanumSquare Neo" w:cs="NanumSquare Neo"/>
+        <w:b/>
+        <w:color w:val="5B636F"/>
+        <w:sz w:val="16"/>
+      </w:rPr>
+      <w:t>TASKPLANNER  |  ROS 2 EXTERNAL INTERFACE CONTRACT</w:t>
+    </w:r>
+    <w:r>
+      <w:rPr>
+        <w:rFonts w:ascii="NanumBarunGothic" w:hAnsi="NanumBarunGothic" w:eastAsia="NanumBarunGothic" w:cs="NanumBarunGothic"/>
+        <w:color w:val="5B636F"/>
+        <w:sz w:val="16"/>
+      </w:rPr>
+      <w:tab/>
+      <w:t>BASELINE 0.3.0</w:t>
+    </w:r>
+  </w:p>
+</w:hdr>
+</file>
+
+<file path=word/header6.xml><?xml version="1.0" encoding="utf-8"?>
 <w:hdr xmlns:m="http://schemas.openxmlformats.org/officeDocument/2006/math" xmlns:mc="http://schemas.openxmlformats.org/markup-compatibility/2006" xmlns:mo="http://schemas.microsoft.com/office/mac/office/2008/main" xmlns:mv="urn:schemas-microsoft-com:mac:vml" xmlns:o="urn:schemas-microsoft-com:office:office" xmlns:r="http://schemas.openxmlformats.org/officeDocument/2006/relationships" xmlns:v="urn:schemas-microsoft-com:vml" xmlns:w10="urn:schemas-microsoft-com:office:word" xmlns:w14="http://schemas.microsoft.com/office/word/2010/wordml" xmlns:w="http://schemas.openxmlformats.org/wordprocessingml/2006/main" xmlns:wne="http://schemas.microsoft.com/office/word/2006/wordml" xmlns:wp14="http://schemas.microsoft.com/office/word/2010/wordprocessingDrawing" xmlns:wp="http://schemas.openxmlformats.org/drawingml/2006/wordprocessingDrawing" xmlns:wpc="http://schemas.microsoft.com/office/word/2010/wordprocessingCanvas" xmlns:wpg="http://schemas.microsoft.com/office/word/2010/wordprocessingGroup" xmlns:wpi="http://schemas.microsoft.com/office/word/2010/wordprocessingInk" xmlns:wps="http://schemas.microsoft.com/office/word/2010/wordprocessingShape" mc:Ignorable="w14 wp14">
   <w:p>
     <w:pPr>

</xml_diff>